<commit_message>
Mise à jour hebdomadaire — 2026-09-14
Reconstitue la fenêtre de collecte en lisant directement les branches
bulletin/AAAA-MM-JJ distantes (jamais fusionnées vers main depuis le
2026-07-21, cf. note ajoutée à bulletins/_a_traiter.md), puis intègre les
trois évolutions franchissant le seuil de crédibilité ≤ 3 STANAG 2511 :
l'incident de Second Thomas Shoal (20-21/07), l'intégration du missile
hypersonique YJ-20 sur destroyer Type-052D (30/07), et le nouveau radar
AESA rotatif du destroyer Weinan (Type-052D, 03/09).

Co-Authored-By: Claude Sonnet 5 <noreply@anthropic.com>
Claude-Session: https://claude.ai/code/session_01PxEQDANfeuu8D9j679tk7i
</commit_message>
<xml_diff>
--- a/documents/Analyse_Capacites_Militaires_Chinoises.docx
+++ b/documents/Analyse_Capacites_Militaires_Chinoises.docx
@@ -1400,6 +1400,30 @@
         <w:jc w:val="both"/>
       </w:pPr>
       <w:r>
+        <w:t xml:space="preserve">Sur le segment des destroyers lance-missiles, deux développements capacitaires ont été documentés au second semestre 2026 sur la classe Type-052D (Luyang III), déjà la plus nombreuse de la flotte hauturière : l'intégration, pour la première fois hors Type-055, du missile hypersonique antinavire YJ-20 (Mach 6+ en croisière, jusqu'à Mach 10 en phase terminale, portée 1 000-1 500 km), observée sur des images officielles diffusées fin juillet 2026 ; et l'admission au service d'une unité récente (Weinan), dotée d'un radar biface à antenne active (AESA) rotatif remplaçant le dôme radar sphérique des versions antérieures. Il s'agit, dans les deux cas, de développements capacitaires documentés, sans indicateur d'emploi opérationnel associé permettant d'en déduire une inflexion d'intention.</w:t>
+      </w:r>
+    </w:p>
+    <w:p>
+      <w:pPr>
+        <w:spacing w:after="220"/>
+      </w:pPr>
+      <w:r>
+        <w:rPr>
+          <w:i/>
+          <w:iCs/>
+          <w:color w:val="595959"/>
+          <w:sz w:val="18"/>
+          <w:szCs w:val="18"/>
+        </w:rPr>
+        <w:t xml:space="preserve">SOURCE : The War Zone, 30/07/2026 [C2] ; MilitaryWatchMagazine, 30/07/2026 [C3] ; Global Times / MND chinois, 02-03/09/2026 [B2] ; Zona Militar, 03/09/2026 [B2]</w:t>
+      </w:r>
+    </w:p>
+    <w:p>
+      <w:pPr>
+        <w:spacing w:after="160"/>
+        <w:jc w:val="both"/>
+      </w:pPr>
+      <w:r>
         <w:t xml:space="preserve">Analyse structurée (Analysis of Competing Hypotheses) — pourquoi la Chine construit-elle une force porte-avions aussi coûteuse alors que sa doctrine A2/AD repose historiquement sur le déni d'accès plutôt que sur la projection de puissance ?</w:t>
       </w:r>
     </w:p>
@@ -2376,6 +2400,30 @@
           <w:szCs w:val="18"/>
         </w:rPr>
         <w:t xml:space="preserve">SOURCE : IISS, The Military Balance 2026, p.258-259</w:t>
+      </w:r>
+    </w:p>
+    <w:p>
+      <w:pPr>
+        <w:spacing w:after="160"/>
+        <w:jc w:val="both"/>
+      </w:pPr>
+      <w:r>
+        <w:t xml:space="preserve">Le 20-21 juillet 2026, un incident survenu à Second Thomas Shoal (Ayungin) a constitué la première confrontation physique directe corroborée dans cette architecture de coercition graduée : des garde-côtes chinois ont frappé un marin philippin lors d'une opération de ravitaillement, après plusieurs mois de coercition non létale (canons à eau, manœuvres de blocage). Il s'agit d'un indicateur concret d'escalade tactique au sein du dispositif décrit ci-dessus ; conformément à la distinction capacité/intention, cet épisode ponctuel ne permet pas à lui seul d'établir une inflexion durable de la posture chinoise envers Manille.</w:t>
+      </w:r>
+    </w:p>
+    <w:p>
+      <w:pPr>
+        <w:spacing w:after="220"/>
+      </w:pPr>
+      <w:r>
+        <w:rPr>
+          <w:i/>
+          <w:iCs/>
+          <w:color w:val="595959"/>
+          <w:sz w:val="18"/>
+          <w:szCs w:val="18"/>
+        </w:rPr>
+        <w:t xml:space="preserve">SOURCE : autorités philippines/État-major philippin, Département d'État américain [A2] ; South China Morning Post [B2] ; Philstar [B2]</w:t>
       </w:r>
     </w:p>
     <w:p>

</xml_diff>

<commit_message>
Maj hebdo 2026-09-21 : incident Second Thomas Shoal dans l'analyse zone grise
Ajoute un paragraphe section 6.3 de la note Word documentant le premier
contact physique confirmé (20/07/2026, Garde-côtière chinoise / marin
philippin) comme illustration du niveau 2 de l'architecture de coercition
graduée, avec mise en garde explicite contre le biais de confirmation et
maintien de la distinction capacité/intention. Vide _a_traiter.md de la
ligne traitée. Excel et PPTX non modifiés : aucun chiffre ou statut de
système recensé n'est devenu obsolète.

Co-Authored-By: Claude Sonnet 5 <noreply@anthropic.com>
Claude-Session: https://claude.ai/code/session_01HsGKj2RdZ8kY3Ckmmk847B
</commit_message>
<xml_diff>
--- a/documents/Analyse_Capacites_Militaires_Chinoises.docx
+++ b/documents/Analyse_Capacites_Militaires_Chinoises.docx
@@ -2376,6 +2376,30 @@
           <w:szCs w:val="18"/>
         </w:rPr>
         <w:t xml:space="preserve">SOURCE : IISS, The Military Balance 2026, p.258-259</w:t>
+      </w:r>
+    </w:p>
+    <w:p>
+      <w:pPr>
+        <w:spacing w:after="160"/>
+        <w:jc w:val="both"/>
+      </w:pPr>
+      <w:r>
+        <w:t xml:space="preserve">Le 20 juillet 2026, un incident à Second Thomas Shoal (Ayungin, Spratleys) a marqué un premier contact physique direct corroboré entre la Garde-côtière chinoise et un marin philippin, blessé selon Manille lors d’une confrontation près du BRP Sierra Madre [autorités philippines/état-major, B2 ; Département d’État américain, A2]. Pékin conteste cette version et attribue l’initiative du contact à des embarcations philippines [porte-parole garde-côtes chinois via SCMP, B2 — version contestée, non tranchée]. Ce passage documenté d’une coercition non létale (canons à eau, lasers) à un contact physique constitue une utilisation plus musclée du niveau 2 (Garde-côtière) de l’architecture à trois niveaux de coercition décrite ci-dessus ; à signaler explicitement car cet épisode nuance la description d’une escalade/désescalade graduelle et maitrisée retenue jusqu’ici dans ce document (biais de confirmation à éviter). En l’absence d’indicateur corroborant (mobilisation logistique, changement de posture de la Marine elle-même), il reste toutefois improbable (20-45%) que cet incident isolé signale une volonté d’escalade soutenue au-delà de la posture de coercition déjà établie — distinction capacité/intention à maintenir.</w:t>
+      </w:r>
+    </w:p>
+    <w:p>
+      <w:pPr>
+        <w:spacing w:after="220"/>
+      </w:pPr>
+      <w:r>
+        <w:rPr>
+          <w:i/>
+          <w:iCs/>
+          <w:color w:val="595959"/>
+          <w:sz w:val="18"/>
+          <w:szCs w:val="18"/>
+        </w:rPr>
+        <w:t xml:space="preserve">SOURCE : autorités philippines / SCMP, « China lodges protest with Philippines after latest clash near Second Thomas Shoal », 21/07/2026 [B2] ; Département d’État américain, communiqué du 21/07/2026 [A2] ; bulletin INTSUM 2026-07-21</w:t>
       </w:r>
     </w:p>
     <w:p>

</xml_diff>

<commit_message>
Maj hebdo 2026-09-28 : blocage d'Ayungin (6.3) et remaniement CMC (5.3)
Co-Authored-By: Claude Sonnet 5.5 <noreply@anthropic.com>
Claude-Session: https://claude.ai/code/session_01X4Z6Vnkh8L7dGu5HutYEZo
</commit_message>
<xml_diff>
--- a/documents/Analyse_Capacites_Militaires_Chinoises.docx
+++ b/documents/Analyse_Capacites_Militaires_Chinoises.docx
@@ -2195,6 +2195,30 @@
     </w:p>
     <w:p>
       <w:pPr>
+        <w:spacing w:after="160"/>
+        <w:jc w:val="both"/>
+      </w:pPr>
+      <w:r>
+        <w:t>Fin septembre 2026, le remaniement au sommet de la CMC s’est amplifié : l’expulsion du parti et de l’armée du vice-président de la CMC Zhang Youxia et du chef d’état-major interarmées Liu Zhenli, actée le 21 septembre, laisserait la CMC avec seulement deux membres actifs identifiés (Xi Jinping, Zhang Shengmin) sur sept habituellement [Reuters via US News/Japan Times/ThePrint, B2]. Il est très probable (80-95%) que ce remaniement pèse sur la coordination opérationnelle de haut niveau à court terme ; il est à peu près autant de chances que non (45-55%) qu’il dégrade durablement la capacité de combat de l’APL, compte tenu des redondances institutionnelles. Biais à surveiller : ne pas prêter à l’APL les réactions d’une armée occidentale (mirror-imaging) ni conclure à une inflexion de posture sans indicateur comportemental corroborant.</w:t>
+      </w:r>
+    </w:p>
+    <w:p>
+      <w:pPr>
+        <w:spacing w:after="220"/>
+      </w:pPr>
+      <w:r>
+        <w:rPr>
+          <w:i/>
+          <w:iCs/>
+          <w:color w:val="595959"/>
+          <w:sz w:val="18"/>
+          <w:szCs w:val="18"/>
+        </w:rPr>
+        <w:t>SOURCE : Reuters (relayé par US News), « Analysis-China’s purges of top military commanders spur questions about war-waging ability », 23/09/2026 [B2] ; bulletin INTSUM 2026-09-25</w:t>
+      </w:r>
+    </w:p>
+    <w:p>
+      <w:pPr>
         <w:pStyle w:val="Heading1"/>
         <w:spacing w:after="200" w:before="400"/>
       </w:pPr>
@@ -2376,6 +2400,30 @@
           <w:szCs w:val="18"/>
         </w:rPr>
         <w:t xml:space="preserve">SOURCE : IISS, The Military Balance 2026, p.258-259</w:t>
+      </w:r>
+    </w:p>
+    <w:p>
+      <w:pPr>
+        <w:spacing w:after="160"/>
+        <w:jc w:val="both"/>
+      </w:pPr>
+      <w:r>
+        <w:t>Le 24-25 septembre 2026, une mission philippine de rotation/ravitaillement vers Ayungin (BRP Sierra Madre, Spratleys) a été bloquée à environ 60 milles nautiques de l’objectif par une quinzaine de bâtiments chinois (garde-côtes, milice maritime et trois bâtiments de la PLAN, dont deux vedettes lance-missiles type 022) ; il s’agit du premier blocage empêchant une mission d’atteindre Ayungin depuis l’arrangement tacite de 2024 [USNI News, Bloomberg, Philstar, B2]. Cet épisode, survenu une semaine après la collision du 18 septembre au large de Palawan [USNI News, Al Jazeera, B2] et dans les heures suivant le sommet Trump-Xi, est à rapprocher de l’incident du 20 juillet : il est probable (55-80%) qu’il traduise un durcissement délibéré de la coercition, et non un incident isolé. Point de vigilance (biais de confirmation) : la présence de bâtiments PLAN aux côtés des garde-côtes déplace vers le niveau 1 (Marine) une partie de la pression, ce qui nuance la description d’une coercition cantonnée aux niveaux 2 et 3. Le lien causal avec le calendrier diplomatique reste une inférence, non un fait établi ; aucun indicateur ne permet d’évaluer une volonté d’empêcher durablement tout ravitaillement — distinction capacité/intention à maintenir.</w:t>
+      </w:r>
+    </w:p>
+    <w:p>
+      <w:pPr>
+        <w:spacing w:after="220"/>
+      </w:pPr>
+      <w:r>
+        <w:rPr>
+          <w:i/>
+          <w:iCs/>
+          <w:color w:val="595959"/>
+          <w:sz w:val="18"/>
+          <w:szCs w:val="18"/>
+        </w:rPr>
+        <w:t>SOURCE : USNI News, 25/09/2026 [B2] ; Bloomberg, « Philippines Says China Blocked Sea Mission, First Since 2024 », 25/09/2026 [B2] ; Philstar, 26/09/2026 [B2] ; bulletin INTSUM 2026-09-26</w:t>
       </w:r>
     </w:p>
     <w:p>

</xml_diff>